<commit_message>
Fix corrupt Word docs (runs placed directly in table cells) + mark docx binary
The generated .docx files had text runs as direct children of table cells,
an OOXML schema violation that Word refused to open (though the zip was
valid). Regenerated with runs wrapped in paragraphs; all three now pass
strict OOXML validation. Added .gitattributes marking Office files binary.

Co-Authored-By: Claude Opus 4.8 <noreply@anthropic.com>
</commit_message>
<xml_diff>
--- a/AI_DataValidator_Data_Governance.docx
+++ b/AI_DataValidator_Data_Governance.docx
@@ -288,17 +288,18 @@
               <w:right w:type="dxa" w:w="120"/>
             </w:tcMar>
           </w:tcPr>
-          <w:r>
-            <w:rPr>
-              <w:b/>
-              <w:bCs/>
-              <w:color w:val="222222"/>
-              <w:sz w:val="21"/>
-              <w:szCs w:val="21"/>
-            </w:rPr>
-            <w:t xml:space="preserve">Schema + samples</w:t>
-          </w:r>
-          <w:p/>
+          <w:p>
+            <w:r>
+              <w:rPr>
+                <w:b/>
+                <w:bCs/>
+                <w:color w:val="222222"/>
+                <w:sz w:val="21"/>
+                <w:szCs w:val="21"/>
+              </w:rPr>
+              <w:t xml:space="preserve">Schema + samples</w:t>
+            </w:r>
+          </w:p>
         </w:tc>
         <w:tc>
           <w:tcPr>
@@ -361,17 +362,18 @@
               <w:right w:type="dxa" w:w="120"/>
             </w:tcMar>
           </w:tcPr>
-          <w:r>
-            <w:rPr>
-              <w:b/>
-              <w:bCs/>
-              <w:color w:val="222222"/>
-              <w:sz w:val="21"/>
-              <w:szCs w:val="21"/>
-            </w:rPr>
-            <w:t xml:space="preserve">Unstructured text</w:t>
-          </w:r>
-          <w:p/>
+          <w:p>
+            <w:r>
+              <w:rPr>
+                <w:b/>
+                <w:bCs/>
+                <w:color w:val="222222"/>
+                <w:sz w:val="21"/>
+                <w:szCs w:val="21"/>
+              </w:rPr>
+              <w:t xml:space="preserve">Unstructured text</w:t>
+            </w:r>
+          </w:p>
         </w:tc>
         <w:tc>
           <w:tcPr>

</xml_diff>